<commit_message>
feat: implement optimized asset library
</commit_message>
<xml_diff>
--- a/docs/素材库优化方案.docx
+++ b/docs/素材库优化方案.docx
@@ -665,7 +665,7 @@
                 <w:color w:val="252A31"/>
                 <w:sz w:val="18"/>
               </w:rPr>
-              <w:t>支持别名搜索、标签 AND 筛选、类型与时间筛选</w:t>
+              <w:t>搜索同时匹配别名、文件名和标签名，并支持类型、素材组与时间筛选</w:t>
             </w:r>
           </w:p>
         </w:tc>
@@ -1552,10 +1552,7 @@
     </w:p>
     <w:p>
       <w:r>
-        <w:rPr>
-          <w:rFonts w:ascii="Calibri" w:hAnsi="Calibri" w:eastAsia="Microsoft YaHei"/>
-        </w:rPr>
-        <w:t>素材库作为独立工作区进入，不与生成任务状态混排。页面以高密度浏览和重复操作为主，建议采用左侧筛选导航、中央素材网格、右侧详情面板的三段结构。</w:t>
+        <w:t>素材库作为独立工作区进入，不与生成任务状态混排。用户点击一级菜单“素材库”后直接进入唯一的素材库页面，默认展示全部未删除素材。页面采用顶部搜索与筛选工具栏、中央素材网格、右侧详情面板的单页面结构；素材库内部不再增加第二层侧边栏或独立导航页。</w:t>
       </w:r>
     </w:p>
     <w:tbl>
@@ -1617,18 +1614,8 @@
             <w:vAlign w:val="center"/>
           </w:tcPr>
           <w:p>
-            <w:pPr>
-              <w:spacing w:after="0"/>
-              <w:jc w:val="left"/>
-            </w:pPr>
             <w:r>
-              <w:rPr>
-                <w:rFonts w:ascii="Calibri" w:hAnsi="Calibri" w:eastAsia="Microsoft YaHei"/>
-                <w:b/>
-                <w:color w:val="0B2545"/>
-                <w:sz w:val="18"/>
-              </w:rPr>
-              <w:t>主要内容</w:t>
+              <w:t>别名/文件名/标签名搜索、图片/视频类型、时间、素材组、排序</w:t>
             </w:r>
           </w:p>
         </w:tc>
@@ -1645,18 +1632,8 @@
             <w:vAlign w:val="center"/>
           </w:tcPr>
           <w:p>
-            <w:pPr>
-              <w:spacing w:after="0"/>
-              <w:jc w:val="left"/>
-            </w:pPr>
             <w:r>
-              <w:rPr>
-                <w:rFonts w:ascii="Calibri" w:hAnsi="Calibri" w:eastAsia="Microsoft YaHei"/>
-                <w:b/>
-                <w:color w:val="0B2545"/>
-                <w:sz w:val="18"/>
-              </w:rPr>
-              <w:t>核心动作</w:t>
+              <w:t>清空筛选、管理素材组、多选、批量打标签</w:t>
             </w:r>
           </w:p>
         </w:tc>
@@ -1708,7 +1685,7 @@
                 <w:color w:val="252A31"/>
                 <w:sz w:val="18"/>
               </w:rPr>
-              <w:t>别名搜索、类型、时间、标签筛选、排序、视图切换</w:t>
+              <w:t>别名/文件名/标签名搜索、类型、时间、素材组、排序</w:t>
             </w:r>
           </w:p>
         </w:tc>
@@ -1752,16 +1729,8 @@
             <w:vAlign w:val="center"/>
           </w:tcPr>
           <w:p>
-            <w:pPr>
-              <w:spacing w:after="0" w:line="259" w:lineRule="auto"/>
-            </w:pPr>
             <w:r>
-              <w:rPr>
-                <w:rFonts w:ascii="Calibri" w:hAnsi="Calibri" w:eastAsia="Microsoft YaHei"/>
-                <w:color w:val="252A31"/>
-                <w:sz w:val="18"/>
-              </w:rPr>
-              <w:t>左侧导航</w:t>
+              <w:t>筛选菜单</w:t>
             </w:r>
           </w:p>
         </w:tc>
@@ -1778,16 +1747,8 @@
             <w:vAlign w:val="center"/>
           </w:tcPr>
           <w:p>
-            <w:pPr>
-              <w:spacing w:after="0" w:line="259" w:lineRule="auto"/>
-            </w:pPr>
             <w:r>
-              <w:rPr>
-                <w:rFonts w:ascii="Calibri" w:hAnsi="Calibri" w:eastAsia="Microsoft YaHei"/>
-                <w:color w:val="252A31"/>
-                <w:sz w:val="18"/>
-              </w:rPr>
-              <w:t>全部素材、图片、视频、标签、素材组、回收站</w:t>
+              <w:t>图片、视频、素材组、回收站状态</w:t>
             </w:r>
           </w:p>
         </w:tc>
@@ -1804,16 +1765,8 @@
             <w:vAlign w:val="center"/>
           </w:tcPr>
           <w:p>
-            <w:pPr>
-              <w:spacing w:after="0" w:line="259" w:lineRule="auto"/>
-            </w:pPr>
             <w:r>
-              <w:rPr>
-                <w:rFonts w:ascii="Calibri" w:hAnsi="Calibri" w:eastAsia="Microsoft YaHei"/>
-                <w:color w:val="252A31"/>
-                <w:sz w:val="18"/>
-              </w:rPr>
-              <w:t>切换集合、创建素材组</w:t>
+              <w:t>刷新同一素材网格，不切换独立页面</w:t>
             </w:r>
           </w:p>
         </w:tc>
@@ -1983,10 +1936,7 @@
     </w:p>
     <w:p>
       <w:r>
-        <w:rPr>
-          <w:rFonts w:ascii="Calibri" w:hAnsi="Calibri" w:eastAsia="Microsoft YaHei"/>
-        </w:rPr>
-        <w:t>建议的一级导航：</w:t>
+        <w:t>页面筛选结构：素材库 = 搜索（别名/文件名/标签名） + 全部素材/图片/视频 + 素材组 + 时间 + 排序。</w:t>
       </w:r>
     </w:p>
     <w:tbl>
@@ -2018,87 +1968,58 @@
             <w:vAlign w:val="center"/>
           </w:tcPr>
           <w:p>
-            <w:pPr>
-              <w:spacing w:after="0" w:line="240" w:lineRule="auto"/>
-            </w:pPr>
             <w:r>
-              <w:rPr>
-                <w:rFonts w:ascii="Consolas" w:hAnsi="Consolas" w:eastAsia="Microsoft YaHei"/>
-                <w:color w:val="263238"/>
-                <w:sz w:val="16"/>
-              </w:rPr>
-              <w:t>素材库</w:t>
-            </w:r>
-            <w:r>
-              <w:br/>
-            </w:r>
-            <w:r>
-              <w:rPr>
-                <w:rFonts w:ascii="Consolas" w:hAnsi="Consolas" w:eastAsia="Microsoft YaHei"/>
-                <w:color w:val="263238"/>
-                <w:sz w:val="16"/>
-              </w:rPr>
-              <w:t>├─ 全部素材</w:t>
-            </w:r>
-            <w:r>
-              <w:br/>
-            </w:r>
-            <w:r>
-              <w:rPr>
-                <w:rFonts w:ascii="Consolas" w:hAnsi="Consolas" w:eastAsia="Microsoft YaHei"/>
-                <w:color w:val="263238"/>
-                <w:sz w:val="16"/>
-              </w:rPr>
-              <w:t>├─ 图片</w:t>
-            </w:r>
-            <w:r>
-              <w:br/>
-            </w:r>
-            <w:r>
-              <w:rPr>
-                <w:rFonts w:ascii="Consolas" w:hAnsi="Consolas" w:eastAsia="Microsoft YaHei"/>
-                <w:color w:val="263238"/>
-                <w:sz w:val="16"/>
-              </w:rPr>
-              <w:t>├─ 视频</w:t>
-            </w:r>
-            <w:r>
-              <w:br/>
-            </w:r>
-            <w:r>
-              <w:rPr>
-                <w:rFonts w:ascii="Consolas" w:hAnsi="Consolas" w:eastAsia="Microsoft YaHei"/>
-                <w:color w:val="263238"/>
-                <w:sz w:val="16"/>
-              </w:rPr>
-              <w:t>├─ 标签</w:t>
-            </w:r>
-            <w:r>
-              <w:br/>
-            </w:r>
-            <w:r>
-              <w:rPr>
-                <w:rFonts w:ascii="Consolas" w:hAnsi="Consolas" w:eastAsia="Microsoft YaHei"/>
-                <w:color w:val="263238"/>
-                <w:sz w:val="16"/>
-              </w:rPr>
-              <w:t>├─ 素材组</w:t>
-            </w:r>
-            <w:r>
-              <w:br/>
-            </w:r>
-            <w:r>
-              <w:rPr>
-                <w:rFonts w:ascii="Consolas" w:hAnsi="Consolas" w:eastAsia="Microsoft YaHei"/>
-                <w:color w:val="263238"/>
-                <w:sz w:val="16"/>
-              </w:rPr>
-              <w:t>└─ 回收站</w:t>
+              <w:t>素材库：搜索（别名 / 文件名 / 标签名） + [全部素材 | 图片 | 视频] + 素材组 + 时间 + 排序</w:t>
             </w:r>
           </w:p>
         </w:tc>
       </w:tr>
     </w:tbl>
+    <w:p>
+      <w:r>
+        <w:t>导航与查询规则：</w:t>
+      </w:r>
+    </w:p>
+    <w:p>
+      <w:pPr>
+        <w:pStyle w:val="ListBullet"/>
+      </w:pPr>
+      <w:r>
+        <w:t>默认展示项目内所有未删除的图片和视频；选择“图片”或“视频”时，同一网格只展示对应类型，并可继续叠加素材组、时间与关键字条件。</w:t>
+      </w:r>
+    </w:p>
+    <w:p>
+      <w:pPr>
+        <w:pStyle w:val="ListBullet"/>
+      </w:pPr>
+      <w:r>
+        <w:t>- “图片”和“视频”复用“全部素材”的搜索、素材组、时间、排序和视图能力，仅分别预设对应的类型筛选；用户仍可继续叠加其他筛选条件。</w:t>
+      </w:r>
+    </w:p>
+    <w:p>
+      <w:pPr>
+        <w:pStyle w:val="ListBullet"/>
+      </w:pPr>
+      <w:r>
+        <w:t>顶部不提供单独的“标签”筛选控件；搜索框同时匹配素材别名、物理文件名和标签名称。标签仍用于素材详情编辑、批量打标签和素材组条件，标签管理通过详情区域的独立入口完成。</w:t>
+      </w:r>
+    </w:p>
+    <w:p>
+      <w:pPr>
+        <w:pStyle w:val="ListBullet"/>
+      </w:pPr>
+      <w:r>
+        <w:t>“素材组”是保存筛选条件的菜单，同时提供创建、编辑和删除；选择素材组后，同一网格展示其动态命中结果，素材组仍可直接拖拽。</w:t>
+      </w:r>
+    </w:p>
+    <w:p>
+      <w:pPr>
+        <w:pStyle w:val="ListBullet"/>
+      </w:pPr>
+      <w:r>
+        <w:t>回收站通过页面工具栏入口切换删除状态，但仍使用同一页面结构和筛选控件，不建立素材库内部侧边栏。图片在卡片和详情中完整显示、不裁切主体；视频在卡片和详情中提供页内播放控制。</w:t>
+      </w:r>
+    </w:p>
     <w:p>
       <w:pPr>
         <w:spacing w:after="0"/>
@@ -2674,7 +2595,7 @@
         <w:rPr>
           <w:rFonts w:ascii="Calibri" w:hAnsi="Calibri" w:eastAsia="Microsoft YaHei"/>
         </w:rPr>
-        <w:t>用户通过别名关键字、标签、类型和时间范围缩小结果。</w:t>
+        <w:t>用户通过别名、物理文件名或标签名称关键字，以及类型、素材组和时间范围缩小结果。</w:t>
       </w:r>
     </w:p>
     <w:p>
@@ -2686,7 +2607,7 @@
         <w:rPr>
           <w:rFonts w:ascii="Calibri" w:hAnsi="Calibri" w:eastAsia="Microsoft YaHei"/>
         </w:rPr>
-        <w:t>选择多个标签时，只返回同时拥有全部所选标签的素材。</w:t>
+        <w:t>选择素材组时，只返回同时拥有该组全部条件标签的素材。</w:t>
       </w:r>
     </w:p>
     <w:p>
@@ -2698,7 +2619,7 @@
         <w:rPr>
           <w:rFonts w:ascii="Calibri" w:hAnsi="Calibri" w:eastAsia="Microsoft YaHei"/>
         </w:rPr>
-        <w:t>用户可将当前标签组合保存为素材组，之后直接打开或拖拽。</w:t>
+        <w:t>用户可创建由多个标签组成的素材组，之后直接打开或拖拽。</w:t>
       </w:r>
     </w:p>
     <w:p>
@@ -4329,7 +4250,7 @@
                 <w:color w:val="252A31"/>
                 <w:sz w:val="18"/>
               </w:rPr>
-              <w:t>自动入库、统一浏览、别名、标签、AND 筛选、素材组、拖拽、来源定位、回收站</w:t>
+              <w:t>自动入库、统一浏览、别名、标签名搜索、素材组 AND 筛选、拖拽、来源定位、回收站</w:t>
             </w:r>
           </w:p>
         </w:tc>
@@ -4575,7 +4496,7 @@
         <w:rPr>
           <w:rFonts w:ascii="Calibri" w:hAnsi="Calibri" w:eastAsia="Microsoft YaHei"/>
         </w:rPr>
-        <w:t>选择两个或更多标签时，只返回同时拥有全部标签的素材。</w:t>
+        <w:t>输入素材的物理文件名或任一标签名称时，可搜索到对应素材；顶部不出现独立标签筛选控件。选择素材组时，只返回同时拥有该组全部条件标签的素材。</w:t>
       </w:r>
     </w:p>
     <w:p>

</xml_diff>

<commit_message>
feat: implement agent document workflow v14 foundation
</commit_message>
<xml_diff>
--- a/docs/素材库优化方案.docx
+++ b/docs/素材库优化方案.docx
@@ -1936,7 +1936,7 @@
     </w:p>
     <w:p>
       <w:r>
-        <w:t>页面筛选结构：素材库 = 搜索（别名/文件名/标签名） + 全部素材/图片/视频 + 素材组 + 时间 + 排序。</w:t>
+        <w:t>页面筛选结构：素材库 = 搜索（别名/文件名/标签名） + 类型下拉（全部素材/图片/视频） + 素材组 + 时间 + 排序。</w:t>
       </w:r>
     </w:p>
     <w:tbl>
@@ -1993,7 +1993,7 @@
         <w:pStyle w:val="ListBullet"/>
       </w:pPr>
       <w:r>
-        <w:t>- “图片”和“视频”复用“全部素材”的搜索、素材组、时间、排序和视图能力，仅分别预设对应的类型筛选；用户仍可继续叠加其他筛选条件。</w:t>
+        <w:t>- 类型使用单选下拉菜单，默认展示“全部素材”；选择“图片”或“视频”时复用相同的搜索、素材组、时间、排序和视图能力，用户仍可继续叠加其他筛选条件。</w:t>
       </w:r>
     </w:p>
     <w:p>

</xml_diff>